<commit_message>
Update project documentation (reliability engineering + deployment + live link)
Co-Authored-By: Claude Opus 4.8 (1M context) <noreply@anthropic.com>
</commit_message>
<xml_diff>
--- a/DOCUMENTATION.docx
+++ b/DOCUMENTATION.docx
@@ -28,6 +28,17 @@
       </w:pPr>
       <w:r>
         <w:t>Aadhavan Alakan  ·  aadhavanalakan97@gmail.com  ·  Generated 2026-06-12</w:t>
+      </w:r>
+    </w:p>
+    <w:p>
+      <w:pPr>
+        <w:jc w:val="center"/>
+      </w:pPr>
+      <w:r>
+        <w:rPr>
+          <w:b/>
+        </w:rPr>
+        <w:t>Live demo: https://aadhavanalakan-finrag-app-eadpfy.streamlit.app   ·   Code: https://github.com/aadhavanalakan/FinRAG</w:t>
       </w:r>
     </w:p>
     <w:p/>
@@ -3246,7 +3257,7 @@
     <w:p/>
     <w:p>
       <w:r>
-        <w:t>Conclusion D: Refusal discipline and guardrails hold under adversarial probing. The one genuine miss (AT&amp;T operating income) is a retrieval miss — the figure was not in the retrieved chunks, so the model correctly refused rather than fabricate. The structural weakness is multi-document synthesis: cross-company comparisons and computed ratios need per-company sub-queries the single-pass retriever does not issue, so they honestly refuse. The full per-item breakdown is in eval/FAILURE_ANALYSIS.md.</w:t>
+        <w:t>Conclusion D: Refusal discipline and guardrails hold under adversarial probing. The one genuine miss (AT&amp;T operating income) is a retrieval miss — the figure was not in the retrieved chunks, so the model correctly refused rather than fabricate. The structural weakness this surfaced was multi-document synthesis: cross-company comparisons needed per-company sub-queries the single-pass retriever did not issue. That gap is now closed in the chatbot answer path via query planning (see Section 10.1) — comparisons resolve each company separately and synthesize. The full per-item breakdown is in eval/FAILURE_ANALYSIS.md.</w:t>
       </w:r>
     </w:p>
     <w:p>
@@ -3513,6 +3524,145 @@
         <w:t>Runtime corpus management (finrag/corpus.py, finrag/edgar.py): add or remove any US-listed company with a 10-K by ticker, validated against SEC EDGAR, from the CLI or the sidebar. The three seed telecoms are protected so the eval set can't be broken.</w:t>
       </w:r>
     </w:p>
+    <w:p>
+      <w:pPr>
+        <w:pStyle w:val="Heading2"/>
+      </w:pPr>
+      <w:r>
+        <w:t>10.1  Reliability Engineering (chat answer path)</w:t>
+      </w:r>
+    </w:p>
+    <w:p>
+      <w:r>
+        <w:t>The eval harness uses a strict top-k retrieval (for a clean chunking/reranking comparison), but the CHATBOT answer path adds three reliability layers so real questions don't miss retrievable facts — the difference between a research artifact and a usable product:</w:t>
+      </w:r>
+    </w:p>
+    <w:p>
+      <w:pPr>
+        <w:pStyle w:val="ListBullet"/>
+      </w:pPr>
+      <w:r>
+        <w:t>Coverage mode — single-company questions feed the model ~20 ranked chunks (not 5) within a large context budget, so a fact that ranks 6th-20th (e.g. the auditor, Deloitte) is still in context. This is the 'put more in context' fix; a stingy top-5 was the root cause of spurious refusals.</w:t>
+      </w:r>
+    </w:p>
+    <w:p>
+      <w:pPr>
+        <w:pStyle w:val="ListBullet"/>
+      </w:pPr>
+      <w:r>
+        <w:t>Income-statement guarantee — any question about a financial line (revenue, operating income, net income, EPS) injects that company's consolidated income-statement table, pinned by a canonical query, so figure lookups never miss the statement line.</w:t>
+      </w:r>
+    </w:p>
+    <w:p>
+      <w:pPr>
+        <w:pStyle w:val="ListBullet"/>
+      </w:pPr>
+      <w:r>
+        <w:t>Query planning for comparisons — a cross-company question is decomposed into one reliable single-company lookup per company, then the comparison is synthesized from those clean, cited answers. This fixes the classic failure where the model picks the wrong company's number or the wrong fiscal year out of a pile of similar tables.</w:t>
+      </w:r>
+    </w:p>
+    <w:p>
+      <w:r>
+        <w:t>Net effect: single lookups, the auditor question, narrative/MD&amp;A questions, and cross-company comparisons all answer correctly, while unanswerable and forward-guidance questions still refuse and injection/advice are still blocked.</w:t>
+      </w:r>
+    </w:p>
+    <w:p>
+      <w:pPr>
+        <w:pStyle w:val="Heading2"/>
+      </w:pPr>
+      <w:r>
+        <w:t>10.2  Deployment</w:t>
+      </w:r>
+    </w:p>
+    <w:p>
+      <w:r>
+        <w:t>Deployed on Streamlit Community Cloud from the public GitHub repo. The BM25 corpus is committed so retrieval works on a fresh clone; the cross-encoder reranker (torch) is left out of the default install to keep the build lean; API keys are supplied via Streamlit secrets (mirrored into environment variables at startup); an optional password gate activates only when APP_PASSWORD is set.</w:t>
+      </w:r>
+    </w:p>
+    <w:tbl>
+      <w:tblPr>
+        <w:tblStyle w:val="LightGrid-Accent1"/>
+        <w:tblW w:type="auto" w:w="0"/>
+        <w:tblLook w:firstColumn="1" w:firstRow="1" w:lastColumn="0" w:lastRow="0" w:noHBand="0" w:noVBand="1" w:val="04A0"/>
+      </w:tblPr>
+      <w:tblGrid>
+        <w:gridCol w:w="4320"/>
+        <w:gridCol w:w="4320"/>
+      </w:tblGrid>
+      <w:tr>
+        <w:tc>
+          <w:tcPr>
+            <w:tcW w:type="dxa" w:w="4320"/>
+          </w:tcPr>
+          <w:p>
+            <w:r>
+              <w:rPr>
+                <w:b/>
+              </w:rPr>
+              <w:t>Resource</w:t>
+            </w:r>
+          </w:p>
+        </w:tc>
+        <w:tc>
+          <w:tcPr>
+            <w:tcW w:type="dxa" w:w="4320"/>
+          </w:tcPr>
+          <w:p>
+            <w:r>
+              <w:rPr>
+                <w:b/>
+              </w:rPr>
+              <w:t>URL</w:t>
+            </w:r>
+          </w:p>
+        </w:tc>
+      </w:tr>
+      <w:tr>
+        <w:tc>
+          <w:tcPr>
+            <w:tcW w:type="dxa" w:w="4320"/>
+          </w:tcPr>
+          <w:p>
+            <w:r>
+              <w:t>Live app</w:t>
+            </w:r>
+          </w:p>
+        </w:tc>
+        <w:tc>
+          <w:tcPr>
+            <w:tcW w:type="dxa" w:w="4320"/>
+          </w:tcPr>
+          <w:p>
+            <w:r>
+              <w:t>https://aadhavanalakan-finrag-app-eadpfy.streamlit.app</w:t>
+            </w:r>
+          </w:p>
+        </w:tc>
+      </w:tr>
+      <w:tr>
+        <w:tc>
+          <w:tcPr>
+            <w:tcW w:type="dxa" w:w="4320"/>
+          </w:tcPr>
+          <w:p>
+            <w:r>
+              <w:t>Source</w:t>
+            </w:r>
+          </w:p>
+        </w:tc>
+        <w:tc>
+          <w:tcPr>
+            <w:tcW w:type="dxa" w:w="4320"/>
+          </w:tcPr>
+          <w:p>
+            <w:r>
+              <w:t>https://github.com/aadhavanalakan/FinRAG</w:t>
+            </w:r>
+          </w:p>
+        </w:tc>
+      </w:tr>
+    </w:tbl>
+    <w:p/>
     <w:p>
       <w:pPr>
         <w:pStyle w:val="Heading1"/>

</xml_diff>